<commit_message>
Integrate Day 2 practice into topic chapters
</commit_message>
<xml_diff>
--- a/docs/03-java-types-and-conversions/03_Java_Variables_Primitives_Literals_Conversions_and_Operators.docx
+++ b/docs/03-java-types-and-conversions/03_Java_Variables_Primitives_Literals_Conversions_and_Operators.docx
@@ -3138,6 +3138,719 @@
         <w:t>Separate Java language semantics from optimized JVM physical placement.</w:t>
       </w:r>
     </w:p>
+    <w:p>
+      <w:r>
+        <w:br w:type="page"/>
+      </w:r>
+    </w:p>
+    <w:p>
+      <w:pPr>
+        <w:pStyle w:val="Heading1"/>
+      </w:pPr>
+      <w:r>
+        <w:t>Practice, Interview &amp; Revision</w:t>
+      </w:r>
+    </w:p>
+    <w:p>
+      <w:r>
+        <w:t>Hands-on practice for variables, literals, primitive conversions, promotion, overflow and precision.</w:t>
+      </w:r>
+    </w:p>
+    <w:p>
+      <w:pPr>
+        <w:pStyle w:val="Heading2"/>
+      </w:pPr>
+      <w:r>
+        <w:t>Practical Labs</w:t>
+      </w:r>
+    </w:p>
+    <w:p>
+      <w:pPr>
+        <w:pStyle w:val="Heading2"/>
+      </w:pPr>
+      <w:r>
+        <w:t>Lab 1 — Definite assignment</w:t>
+      </w:r>
+    </w:p>
+    <w:p>
+      <w:r>
+        <w:t>Run a local variable before assignment and compare with a field.</w:t>
+      </w:r>
+    </w:p>
+    <w:p>
+      <w:pPr>
+        <w:pStyle w:val="CodeBlock"/>
+        <w:shd w:fill="F7F7F7"/>
+      </w:pPr>
+      <w:r>
+        <w:rPr>
+          <w:rFonts w:ascii="Consolas" w:hAnsi="Consolas"/>
+        </w:rPr>
+        <w:t>int x;</w:t>
+      </w:r>
+      <w:r>
+        <w:br/>
+      </w:r>
+      <w:r>
+        <w:rPr>
+          <w:rFonts w:ascii="Consolas" w:hAnsi="Consolas"/>
+        </w:rPr>
+        <w:t>// System.out.println(x); // compile error</w:t>
+      </w:r>
+      <w:r>
+        <w:br/>
+      </w:r>
+      <w:r>
+        <w:rPr>
+          <w:rFonts w:ascii="Consolas" w:hAnsi="Consolas"/>
+        </w:rPr>
+      </w:r>
+      <w:r>
+        <w:br/>
+      </w:r>
+      <w:r>
+        <w:rPr>
+          <w:rFonts w:ascii="Consolas" w:hAnsi="Consolas"/>
+        </w:rPr>
+        <w:t>static int field;</w:t>
+      </w:r>
+      <w:r>
+        <w:br/>
+      </w:r>
+      <w:r>
+        <w:rPr>
+          <w:rFonts w:ascii="Consolas" w:hAnsi="Consolas"/>
+        </w:rPr>
+        <w:t>// field prints 0</w:t>
+      </w:r>
+    </w:p>
+    <w:p>
+      <w:pPr>
+        <w:pStyle w:val="Heading2"/>
+      </w:pPr>
+      <w:r>
+        <w:t>Lab 2 — Literal typing</w:t>
+      </w:r>
+    </w:p>
+    <w:p>
+      <w:r>
+        <w:t>Prove that the destination type does not retroactively change an integer literal.</w:t>
+      </w:r>
+    </w:p>
+    <w:p>
+      <w:pPr>
+        <w:pStyle w:val="CodeBlock"/>
+        <w:shd w:fill="F7F7F7"/>
+      </w:pPr>
+      <w:r>
+        <w:rPr>
+          <w:rFonts w:ascii="Consolas" w:hAnsi="Consolas"/>
+        </w:rPr>
+        <w:t>long bad = 3_000_000_000;   // compile error</w:t>
+      </w:r>
+      <w:r>
+        <w:br/>
+      </w:r>
+      <w:r>
+        <w:rPr>
+          <w:rFonts w:ascii="Consolas" w:hAnsi="Consolas"/>
+        </w:rPr>
+        <w:t>long ok  = 3_000_000_000L;</w:t>
+      </w:r>
+    </w:p>
+    <w:p>
+      <w:pPr>
+        <w:pStyle w:val="Heading2"/>
+      </w:pPr>
+      <w:r>
+        <w:t>Lab 3 — Constant narrowing</w:t>
+      </w:r>
+    </w:p>
+    <w:p>
+      <w:r>
+        <w:t>Compare literal/constant narrowing with runtime int variables.</w:t>
+      </w:r>
+    </w:p>
+    <w:p>
+      <w:pPr>
+        <w:pStyle w:val="CodeBlock"/>
+        <w:shd w:fill="F7F7F7"/>
+      </w:pPr>
+      <w:r>
+        <w:rPr>
+          <w:rFonts w:ascii="Consolas" w:hAnsi="Consolas"/>
+        </w:rPr>
+        <w:t>byte a = 100;</w:t>
+      </w:r>
+      <w:r>
+        <w:br/>
+      </w:r>
+      <w:r>
+        <w:rPr>
+          <w:rFonts w:ascii="Consolas" w:hAnsi="Consolas"/>
+        </w:rPr>
+        <w:t>final int x = 100;</w:t>
+      </w:r>
+      <w:r>
+        <w:br/>
+      </w:r>
+      <w:r>
+        <w:rPr>
+          <w:rFonts w:ascii="Consolas" w:hAnsi="Consolas"/>
+        </w:rPr>
+        <w:t>byte b = x;</w:t>
+      </w:r>
+      <w:r>
+        <w:br/>
+      </w:r>
+      <w:r>
+        <w:rPr>
+          <w:rFonts w:ascii="Consolas" w:hAnsi="Consolas"/>
+        </w:rPr>
+        <w:t>int y = 100;</w:t>
+      </w:r>
+      <w:r>
+        <w:br/>
+      </w:r>
+      <w:r>
+        <w:rPr>
+          <w:rFonts w:ascii="Consolas" w:hAnsi="Consolas"/>
+        </w:rPr>
+        <w:t>// byte c = y; // compile error</w:t>
+      </w:r>
+    </w:p>
+    <w:p>
+      <w:pPr>
+        <w:pStyle w:val="Heading2"/>
+      </w:pPr>
+      <w:r>
+        <w:t>Lab 4 — Narrowing wrap</w:t>
+      </w:r>
+    </w:p>
+    <w:p>
+      <w:r>
+        <w:t>Observe narrowing of 130 to byte.</w:t>
+      </w:r>
+    </w:p>
+    <w:p>
+      <w:pPr>
+        <w:pStyle w:val="CodeBlock"/>
+        <w:shd w:fill="F7F7F7"/>
+      </w:pPr>
+      <w:r>
+        <w:rPr>
+          <w:rFonts w:ascii="Consolas" w:hAnsi="Consolas"/>
+        </w:rPr>
+        <w:t>int x = 130;</w:t>
+      </w:r>
+      <w:r>
+        <w:br/>
+      </w:r>
+      <w:r>
+        <w:rPr>
+          <w:rFonts w:ascii="Consolas" w:hAnsi="Consolas"/>
+        </w:rPr>
+        <w:t>byte b = (byte) x;</w:t>
+      </w:r>
+      <w:r>
+        <w:br/>
+      </w:r>
+      <w:r>
+        <w:rPr>
+          <w:rFonts w:ascii="Consolas" w:hAnsi="Consolas"/>
+        </w:rPr>
+        <w:t>System.out.println(b); // -126</w:t>
+      </w:r>
+    </w:p>
+    <w:p>
+      <w:pPr>
+        <w:pStyle w:val="Heading2"/>
+      </w:pPr>
+      <w:r>
+        <w:t>Lab 5 — Intermediate overflow</w:t>
+      </w:r>
+    </w:p>
+    <w:p>
+      <w:r>
+        <w:t>Show int multiplication overflowing before assignment to long.</w:t>
+      </w:r>
+    </w:p>
+    <w:p>
+      <w:pPr>
+        <w:pStyle w:val="CodeBlock"/>
+        <w:shd w:fill="F7F7F7"/>
+      </w:pPr>
+      <w:r>
+        <w:rPr>
+          <w:rFonts w:ascii="Consolas" w:hAnsi="Consolas"/>
+        </w:rPr>
+        <w:t>int a=1_500_000_000, b=2;</w:t>
+      </w:r>
+      <w:r>
+        <w:br/>
+      </w:r>
+      <w:r>
+        <w:rPr>
+          <w:rFonts w:ascii="Consolas" w:hAnsi="Consolas"/>
+        </w:rPr>
+        <w:t>long wrong=a*b;</w:t>
+      </w:r>
+      <w:r>
+        <w:br/>
+      </w:r>
+      <w:r>
+        <w:rPr>
+          <w:rFonts w:ascii="Consolas" w:hAnsi="Consolas"/>
+        </w:rPr>
+        <w:t>long right=(long)a*b;</w:t>
+      </w:r>
+    </w:p>
+    <w:p>
+      <w:pPr>
+        <w:pStyle w:val="Heading2"/>
+      </w:pPr>
+      <w:r>
+        <w:t>Lab 6 — byte promotion</w:t>
+      </w:r>
+    </w:p>
+    <w:p>
+      <w:r>
+        <w:t>Show byte + byte becomes int.</w:t>
+      </w:r>
+    </w:p>
+    <w:p>
+      <w:pPr>
+        <w:pStyle w:val="CodeBlock"/>
+        <w:shd w:fill="F7F7F7"/>
+      </w:pPr>
+      <w:r>
+        <w:rPr>
+          <w:rFonts w:ascii="Consolas" w:hAnsi="Consolas"/>
+        </w:rPr>
+        <w:t>byte a=10,b=20;</w:t>
+      </w:r>
+      <w:r>
+        <w:br/>
+      </w:r>
+      <w:r>
+        <w:rPr>
+          <w:rFonts w:ascii="Consolas" w:hAnsi="Consolas"/>
+        </w:rPr>
+        <w:t>int c=a+b;</w:t>
+      </w:r>
+      <w:r>
+        <w:br/>
+      </w:r>
+      <w:r>
+        <w:rPr>
+          <w:rFonts w:ascii="Consolas" w:hAnsi="Consolas"/>
+        </w:rPr>
+        <w:t>// byte d=a+b; // compile error</w:t>
+      </w:r>
+    </w:p>
+    <w:p>
+      <w:pPr>
+        <w:pStyle w:val="Heading2"/>
+      </w:pPr>
+      <w:r>
+        <w:t>Lab 7 — Compound assignment</w:t>
+      </w:r>
+    </w:p>
+    <w:p>
+      <w:r>
+        <w:t>Show implicit narrowing performed by +=.</w:t>
+      </w:r>
+    </w:p>
+    <w:p>
+      <w:pPr>
+        <w:pStyle w:val="CodeBlock"/>
+        <w:shd w:fill="F7F7F7"/>
+      </w:pPr>
+      <w:r>
+        <w:rPr>
+          <w:rFonts w:ascii="Consolas" w:hAnsi="Consolas"/>
+        </w:rPr>
+        <w:t>byte b=120;</w:t>
+      </w:r>
+      <w:r>
+        <w:br/>
+      </w:r>
+      <w:r>
+        <w:rPr>
+          <w:rFonts w:ascii="Consolas" w:hAnsi="Consolas"/>
+        </w:rPr>
+        <w:t>b += 20;</w:t>
+      </w:r>
+      <w:r>
+        <w:br/>
+      </w:r>
+      <w:r>
+        <w:rPr>
+          <w:rFonts w:ascii="Consolas" w:hAnsi="Consolas"/>
+        </w:rPr>
+        <w:t>System.out.println(b);</w:t>
+      </w:r>
+    </w:p>
+    <w:p>
+      <w:pPr>
+        <w:pStyle w:val="Heading2"/>
+      </w:pPr>
+      <w:r>
+        <w:t>Lab 8 — Integer division</w:t>
+      </w:r>
+    </w:p>
+    <w:p>
+      <w:r>
+        <w:t>Compare 5/2 and 5/2.0.</w:t>
+      </w:r>
+    </w:p>
+    <w:p>
+      <w:pPr>
+        <w:pStyle w:val="CodeBlock"/>
+        <w:shd w:fill="F7F7F7"/>
+      </w:pPr>
+      <w:r>
+        <w:rPr>
+          <w:rFonts w:ascii="Consolas" w:hAnsi="Consolas"/>
+        </w:rPr>
+        <w:t>System.out.println((double)(5/2)); // 2.0</w:t>
+      </w:r>
+      <w:r>
+        <w:br/>
+      </w:r>
+      <w:r>
+        <w:rPr>
+          <w:rFonts w:ascii="Consolas" w:hAnsi="Consolas"/>
+        </w:rPr>
+        <w:t>System.out.println(5/2.0);       // 2.5</w:t>
+      </w:r>
+    </w:p>
+    <w:p>
+      <w:pPr>
+        <w:pStyle w:val="Heading2"/>
+      </w:pPr>
+      <w:r>
+        <w:t>Lab 9 — Floating precision</w:t>
+      </w:r>
+    </w:p>
+    <w:p>
+      <w:r>
+        <w:t>Observe decimal approximation.</w:t>
+      </w:r>
+    </w:p>
+    <w:p>
+      <w:pPr>
+        <w:pStyle w:val="CodeBlock"/>
+        <w:shd w:fill="F7F7F7"/>
+      </w:pPr>
+      <w:r>
+        <w:rPr>
+          <w:rFonts w:ascii="Consolas" w:hAnsi="Consolas"/>
+        </w:rPr>
+        <w:t>System.out.println(0.1 + 0.2);</w:t>
+      </w:r>
+    </w:p>
+    <w:p>
+      <w:pPr>
+        <w:pStyle w:val="Heading2"/>
+      </w:pPr>
+      <w:r>
+        <w:t>Lab 10 — Infinity and NaN</w:t>
+      </w:r>
+    </w:p>
+    <w:p>
+      <w:r>
+        <w:t>Compare floating division by zero with integer division by zero.</w:t>
+      </w:r>
+    </w:p>
+    <w:p>
+      <w:pPr>
+        <w:pStyle w:val="CodeBlock"/>
+        <w:shd w:fill="F7F7F7"/>
+      </w:pPr>
+      <w:r>
+        <w:rPr>
+          <w:rFonts w:ascii="Consolas" w:hAnsi="Consolas"/>
+        </w:rPr>
+        <w:t>System.out.println(10.0/0.0);</w:t>
+      </w:r>
+      <w:r>
+        <w:br/>
+      </w:r>
+      <w:r>
+        <w:rPr>
+          <w:rFonts w:ascii="Consolas" w:hAnsi="Consolas"/>
+        </w:rPr>
+        <w:t>System.out.println(0.0/0.0);</w:t>
+      </w:r>
+      <w:r>
+        <w:br/>
+      </w:r>
+      <w:r>
+        <w:rPr>
+          <w:rFonts w:ascii="Consolas" w:hAnsi="Consolas"/>
+        </w:rPr>
+        <w:t>// System.out.println(10/0); // ArithmeticException</w:t>
+      </w:r>
+    </w:p>
+    <w:p>
+      <w:pPr>
+        <w:pStyle w:val="Heading2"/>
+      </w:pPr>
+      <w:r>
+        <w:t>Senior/Staff Interview Scenarios</w:t>
+      </w:r>
+    </w:p>
+    <w:p>
+      <w:pPr>
+        <w:pStyle w:val="Heading2"/>
+      </w:pPr>
+      <w:r>
+        <w:t>Why does byte + byte produce int?</w:t>
+      </w:r>
+    </w:p>
+    <w:p>
+      <w:r>
+        <w:t>Binary numeric promotion promotes byte/short/char operands to int.</w:t>
+      </w:r>
+    </w:p>
+    <w:p>
+      <w:pPr>
+        <w:pStyle w:val="Heading2"/>
+      </w:pPr>
+      <w:r>
+        <w:t>Why can `long result = a*b` overflow when a and b are int?</w:t>
+      </w:r>
+    </w:p>
+    <w:p>
+      <w:r>
+        <w:t>The multiplication is evaluated as int before the assignment conversion to long.</w:t>
+      </w:r>
+    </w:p>
+    <w:p>
+      <w:pPr>
+        <w:pStyle w:val="Heading2"/>
+      </w:pPr>
+      <w:r>
+        <w:t>Is long → double “safe”?</w:t>
+      </w:r>
+    </w:p>
+    <w:p>
+      <w:r>
+        <w:t>It is widening and needs no cast, but can lose exact integer precision.</w:t>
+      </w:r>
+    </w:p>
+    <w:p>
+      <w:pPr>
+        <w:pStyle w:val="Heading2"/>
+      </w:pPr>
+      <w:r>
+        <w:t>Is a cast a validation?</w:t>
+      </w:r>
+    </w:p>
+    <w:p>
+      <w:r>
+        <w:t>No. Narrowing can wrap/truncate or otherwise lose information.</w:t>
+      </w:r>
+    </w:p>
+    <w:p>
+      <w:pPr>
+        <w:pStyle w:val="Heading2"/>
+      </w:pPr>
+      <w:r>
+        <w:t>Why does `double d=5/2` become 2.0?</w:t>
+      </w:r>
+    </w:p>
+    <w:p>
+      <w:r>
+        <w:t>5/2 is int division producing 2; only then is 2 widened to double.</w:t>
+      </w:r>
+    </w:p>
+    <w:p>
+      <w:pPr>
+        <w:pStyle w:val="Heading2"/>
+      </w:pPr>
+      <w:r>
+        <w:t>Recall Questions and Answer Key</w:t>
+      </w:r>
+    </w:p>
+    <w:p>
+      <w:pPr>
+        <w:pStyle w:val="Heading3"/>
+      </w:pPr>
+      <w:r>
+        <w:t>Q1. What are Java’s 8 primitive types?</w:t>
+      </w:r>
+    </w:p>
+    <w:p>
+      <w:r>
+        <w:t>byte, short, int, long, float, double, char and boolean.</w:t>
+      </w:r>
+    </w:p>
+    <w:p>
+      <w:pPr>
+        <w:pStyle w:val="Heading3"/>
+      </w:pPr>
+      <w:r>
+        <w:t>Q2. What is the difference between `int x = 10;` and `Integer x = 10;`?</w:t>
+      </w:r>
+    </w:p>
+    <w:p>
+      <w:r>
+        <w:t>`int` is a primitive value. `Integer` is a reference to an immutable wrapper object (or cached instance); it can be null and participates in generics/collections.</w:t>
+      </w:r>
+    </w:p>
+    <w:p>
+      <w:pPr>
+        <w:pStyle w:val="Heading3"/>
+      </w:pPr>
+      <w:r>
+        <w:t>Q3. Why does `byte a=10; byte b=20; byte c=a+b;` not compile?</w:t>
+      </w:r>
+    </w:p>
+    <w:p>
+      <w:r>
+        <w:t>byte operands are promoted to int for arithmetic, so a+b has type int and cannot be assigned to byte without a permitted constant conversion or explicit cast.</w:t>
+      </w:r>
+    </w:p>
+    <w:p>
+      <w:pPr>
+        <w:pStyle w:val="Heading3"/>
+      </w:pPr>
+      <w:r>
+        <w:t>Q4. What is wrong with `int a=1_500_000_000; int b=2; long result=a*b;`?</w:t>
+      </w:r>
+    </w:p>
+    <w:p>
+      <w:r>
+        <w:t>a*b is evaluated as int and can overflow before the result is widened to long. Promote an operand first, e.g. `(long)a*b`.</w:t>
+      </w:r>
+    </w:p>
+    <w:p>
+      <w:pPr>
+        <w:pStyle w:val="Heading3"/>
+      </w:pPr>
+      <w:r>
+        <w:t>Q5. What is printed by `double result = 5 / 2;`?</w:t>
+      </w:r>
+    </w:p>
+    <w:p>
+      <w:r>
+        <w:t>2.0, because 5/2 is int division producing 2, then widened to double.</w:t>
+      </w:r>
+    </w:p>
+    <w:p>
+      <w:pPr>
+        <w:pStyle w:val="Heading3"/>
+      </w:pPr>
+      <w:r>
+        <w:t>Q6. What happens after `int x=Integer.MAX_VALUE; x++;`?</w:t>
+      </w:r>
+    </w:p>
+    <w:p>
+      <w:r>
+        <w:t>It wraps to Integer.MIN_VALUE under ordinary int arithmetic.</w:t>
+      </w:r>
+    </w:p>
+    <w:p>
+      <w:pPr>
+        <w:pStyle w:val="Heading3"/>
+      </w:pPr>
+      <w:r>
+        <w:t>Q7. What is the difference between widening and narrowing primitive conversion?</w:t>
+      </w:r>
+    </w:p>
+    <w:p>
+      <w:r>
+        <w:t>Widening moves to a permitted broader type and is usually implicit; narrowing moves to a smaller/different range and normally needs an explicit cast and may lose information.</w:t>
+      </w:r>
+    </w:p>
+    <w:p>
+      <w:pPr>
+        <w:pStyle w:val="Heading3"/>
+      </w:pPr>
+      <w:r>
+        <w:t>Q8. Does widening always preserve exact numeric information?</w:t>
+      </w:r>
+    </w:p>
+    <w:p>
+      <w:r>
+        <w:t>No. Integral-to-floating widening can lose exact precision, e.g. large long to double/float.</w:t>
+      </w:r>
+    </w:p>
+    <w:p>
+      <w:pPr>
+        <w:pStyle w:val="Heading2"/>
+      </w:pPr>
+      <w:r>
+        <w:t>Code Challenge</w:t>
+      </w:r>
+    </w:p>
+    <w:p>
+      <w:pPr>
+        <w:pStyle w:val="Heading2"/>
+      </w:pPr>
+      <w:r>
+        <w:t>Challenge 3 — Promotion, narrowing and wrap</w:t>
+      </w:r>
+    </w:p>
+    <w:p>
+      <w:pPr>
+        <w:pStyle w:val="CodeBlock"/>
+        <w:shd w:fill="F7F7F7"/>
+      </w:pPr>
+      <w:r>
+        <w:rPr>
+          <w:rFonts w:ascii="Consolas" w:hAnsi="Consolas"/>
+        </w:rPr>
+        <w:t>byte a = 100;</w:t>
+      </w:r>
+      <w:r>
+        <w:br/>
+      </w:r>
+      <w:r>
+        <w:rPr>
+          <w:rFonts w:ascii="Consolas" w:hAnsi="Consolas"/>
+        </w:rPr>
+        <w:t>byte b = 30;</w:t>
+      </w:r>
+      <w:r>
+        <w:br/>
+      </w:r>
+      <w:r>
+        <w:rPr>
+          <w:rFonts w:ascii="Consolas" w:hAnsi="Consolas"/>
+        </w:rPr>
+        <w:t>byte c = (byte) (a + b);</w:t>
+      </w:r>
+      <w:r>
+        <w:br/>
+      </w:r>
+      <w:r>
+        <w:rPr>
+          <w:rFonts w:ascii="Consolas" w:hAnsi="Consolas"/>
+        </w:rPr>
+        <w:t>System.out.println(c);</w:t>
+      </w:r>
+    </w:p>
+    <w:p>
+      <w:r>
+        <w:t>Predict the result and explain promotion, addition, narrowing and wrap.</w:t>
+      </w:r>
+    </w:p>
+    <w:p>
+      <w:pPr>
+        <w:pStyle w:val="Heading3"/>
+      </w:pPr>
+      <w:r>
+        <w:t>Solution</w:t>
+      </w:r>
+    </w:p>
+    <w:p>
+      <w:r>
+        <w:t>a and b are promoted to int, producing mathematical 130 as an int. The explicit cast narrows 130 to byte, yielding -126 under Java’s narrowing conversion rules.</w:t>
+      </w:r>
+    </w:p>
     <w:sectPr>
       <w:headerReference w:type="default" r:id="rId9"/>
       <w:footerReference w:type="default" r:id="rId10"/>

</xml_diff>